<commit_message>
More fully support generic liine items
</commit_message>
<xml_diff>
--- a/templates/human_invoice_template.docx
+++ b/templates/human_invoice_template.docx
@@ -22,12 +22,12 @@
           <wp:anchor behindDoc="0" distT="0" distB="0" distL="0" distR="0" simplePos="0" locked="0" layoutInCell="0" allowOverlap="1" relativeHeight="3">
             <wp:simplePos x="0" y="0"/>
             <wp:positionH relativeFrom="column">
-              <wp:posOffset>30480</wp:posOffset>
+              <wp:posOffset>25400</wp:posOffset>
             </wp:positionH>
             <wp:positionV relativeFrom="paragraph">
               <wp:posOffset>5715</wp:posOffset>
             </wp:positionV>
-            <wp:extent cx="1459230" cy="1022985"/>
+            <wp:extent cx="1219200" cy="1022985"/>
             <wp:effectExtent l="0" t="0" r="0" b="0"/>
             <wp:wrapSquare wrapText="largest"/>
             <wp:docPr id="1" name="Image1" descr=""/>
@@ -45,6 +45,7 @@
                   </pic:nvPicPr>
                   <pic:blipFill>
                     <a:blip r:embed="rId2"/>
+                    <a:srcRect l="12053" t="0" r="4395" b="0"/>
                     <a:stretch>
                       <a:fillRect/>
                     </a:stretch>
@@ -52,7 +53,7 @@
                   <pic:spPr bwMode="auto">
                     <a:xfrm>
                       <a:off x="0" y="0"/>
-                      <a:ext cx="1459230" cy="1022985"/>
+                      <a:ext cx="1219200" cy="1022985"/>
                     </a:xfrm>
                     <a:prstGeom prst="rect">
                       <a:avLst/>
@@ -100,29 +101,7 @@
           <w:sz w:val="22"/>
           <w:szCs w:val="22"/>
         </w:rPr>
-        <w:t>10</w:t>
-      </w:r>
-      <w:r>
-        <w:rPr>
-          <w:rFonts w:ascii="Libre Baskerville" w:hAnsi="Libre Baskerville"/>
-          <w:b w:val="false"/>
-          <w:bCs w:val="false"/>
-          <w:color w:val="auto"/>
-          <w:sz w:val="22"/>
-          <w:szCs w:val="22"/>
-        </w:rPr>
-        <w:t>0</w:t>
-      </w:r>
-      <w:r>
-        <w:rPr>
-          <w:rFonts w:ascii="Libre Baskerville" w:hAnsi="Libre Baskerville"/>
-          <w:b w:val="false"/>
-          <w:bCs w:val="false"/>
-          <w:color w:val="auto"/>
-          <w:sz w:val="22"/>
-          <w:szCs w:val="22"/>
-        </w:rPr>
-        <w:t>0 Brussels · BELGIUM</w:t>
+        <w:t>1000 Brussels · BELGIUM</w:t>
       </w:r>
     </w:p>
     <w:p>
@@ -151,57 +130,7 @@
           <w:sz w:val="22"/>
           <w:szCs w:val="22"/>
         </w:rPr>
-        <w:t>BE 1</w:t>
-      </w:r>
-      <w:r>
-        <w:rPr>
-          <w:rFonts w:ascii="Libre Baskerville" w:hAnsi="Libre Baskerville"/>
-          <w:b/>
-          <w:color w:val="auto"/>
-          <w:sz w:val="22"/>
-          <w:szCs w:val="22"/>
-        </w:rPr>
-        <w:t>234</w:t>
-      </w:r>
-      <w:r>
-        <w:rPr>
-          <w:rFonts w:ascii="Libre Baskerville" w:hAnsi="Libre Baskerville"/>
-          <w:b/>
-          <w:color w:val="auto"/>
-          <w:sz w:val="22"/>
-          <w:szCs w:val="22"/>
-        </w:rPr>
-        <w:t>.</w:t>
-      </w:r>
-      <w:r>
-        <w:rPr>
-          <w:rFonts w:ascii="Libre Baskerville" w:hAnsi="Libre Baskerville"/>
-          <w:b/>
-          <w:color w:val="auto"/>
-          <w:sz w:val="22"/>
-          <w:szCs w:val="22"/>
-        </w:rPr>
-        <w:t>567</w:t>
-      </w:r>
-      <w:r>
-        <w:rPr>
-          <w:rFonts w:ascii="Libre Baskerville" w:hAnsi="Libre Baskerville"/>
-          <w:b/>
-          <w:color w:val="auto"/>
-          <w:sz w:val="22"/>
-          <w:szCs w:val="22"/>
-        </w:rPr>
-        <w:t>.</w:t>
-      </w:r>
-      <w:r>
-        <w:rPr>
-          <w:rFonts w:ascii="Libre Baskerville" w:hAnsi="Libre Baskerville"/>
-          <w:b/>
-          <w:color w:val="auto"/>
-          <w:sz w:val="22"/>
-          <w:szCs w:val="22"/>
-        </w:rPr>
-        <w:t>89</w:t>
+        <w:t>BE 1234.567.89</w:t>
       </w:r>
     </w:p>
     <w:p>
@@ -224,51 +153,7 @@
           <w:sz w:val="21"/>
           <w:szCs w:val="21"/>
         </w:rPr>
-        <w:t>info</w:t>
-      </w:r>
-      <w:r>
-        <w:rPr>
-          <w:rFonts w:ascii="Liberation Mono" w:hAnsi="Liberation Mono"/>
-          <w:b w:val="false"/>
-          <w:bCs w:val="false"/>
-          <w:color w:val="auto"/>
-          <w:sz w:val="21"/>
-          <w:szCs w:val="21"/>
-        </w:rPr>
-        <w:t>@</w:t>
-      </w:r>
-      <w:r>
-        <w:rPr>
-          <w:rFonts w:ascii="Liberation Mono" w:hAnsi="Liberation Mono"/>
-          <w:b w:val="false"/>
-          <w:bCs w:val="false"/>
-          <w:color w:val="auto"/>
-          <w:sz w:val="21"/>
-          <w:szCs w:val="21"/>
-        </w:rPr>
-        <w:t>mycompany</w:t>
-      </w:r>
-      <w:r>
-        <w:rPr>
-          <w:rFonts w:ascii="Liberation Mono" w:hAnsi="Liberation Mono"/>
-          <w:b w:val="false"/>
-          <w:bCs w:val="false"/>
-          <w:color w:val="auto"/>
-          <w:sz w:val="21"/>
-          <w:szCs w:val="21"/>
-        </w:rPr>
-        <w:t>.</w:t>
-      </w:r>
-      <w:r>
-        <w:rPr>
-          <w:rFonts w:ascii="Liberation Mono" w:hAnsi="Liberation Mono"/>
-          <w:b w:val="false"/>
-          <w:bCs w:val="false"/>
-          <w:color w:val="auto"/>
-          <w:sz w:val="21"/>
-          <w:szCs w:val="21"/>
-        </w:rPr>
-        <w:t>be</w:t>
+        <w:t>info@mycompany.be</w:t>
       </w:r>
     </w:p>
     <w:p>
@@ -311,9 +196,9 @@
       </w:pPr>
       <w:r>
         <w:rPr>
-          <w:rFonts w:ascii="Montserrat Black" w:hAnsi="Montserrat Black"/>
+          <w:rFonts w:ascii="Calibri" w:hAnsi="Calibri"/>
           <w:b/>
-          <w:color w:val="158466"/>
+          <w:color w:val="46A6AF"/>
           <w:sz w:val="56"/>
           <w:szCs w:val="22"/>
         </w:rPr>
@@ -341,9 +226,9 @@
       </w:r>
       <w:r>
         <w:rPr>
-          <w:rFonts w:ascii="Montserrat Black" w:hAnsi="Montserrat Black"/>
+          <w:rFonts w:ascii="Libre Baskerville" w:hAnsi="Libre Baskerville"/>
           <w:b/>
-          <w:color w:val="158466"/>
+          <w:color w:val="46A6AF"/>
           <w:sz w:val="36"/>
           <w:szCs w:val="36"/>
         </w:rPr>
@@ -378,15 +263,14 @@
         <w:pStyle w:val="Normal"/>
         <w:jc w:val="left"/>
         <w:rPr>
-          <w:rFonts w:ascii="Montserrat Black" w:hAnsi="Montserrat Black"/>
-          <w:color w:val="158466"/>
+          <w:color w:val="46A6AF"/>
         </w:rPr>
       </w:pPr>
       <w:r>
         <w:rPr>
-          <w:rFonts w:ascii="Montserrat Black" w:hAnsi="Montserrat Black"/>
+          <w:rFonts w:ascii="Libre Baskerville" w:hAnsi="Libre Baskerville"/>
           <w:b/>
-          <w:color w:val="158466"/>
+          <w:color w:val="46A6AF"/>
           <w:sz w:val="32"/>
           <w:szCs w:val="32"/>
         </w:rPr>
@@ -883,29 +767,7 @@
         <w:sz w:val="21"/>
         <w:szCs w:val="21"/>
       </w:rPr>
-      <w:t xml:space="preserve"> (</w:t>
-    </w:r>
-    <w:r>
-      <w:rPr>
-        <w:rFonts w:ascii="Libre Baskerville" w:hAnsi="Libre Baskerville"/>
-        <w:b w:val="false"/>
-        <w:bCs w:val="false"/>
-        <w:color w:val="auto"/>
-        <w:sz w:val="21"/>
-        <w:szCs w:val="21"/>
-      </w:rPr>
-      <w:t>Bank Name</w:t>
-    </w:r>
-    <w:r>
-      <w:rPr>
-        <w:rFonts w:ascii="Libre Baskerville" w:hAnsi="Libre Baskerville"/>
-        <w:b w:val="false"/>
-        <w:bCs w:val="false"/>
-        <w:color w:val="auto"/>
-        <w:sz w:val="21"/>
-        <w:szCs w:val="21"/>
-      </w:rPr>
-      <w:t>)</w:t>
+      <w:t xml:space="preserve"> (Bank Name)</w:t>
     </w:r>
   </w:p>
 </w:ftr>

</xml_diff>